<commit_message>
Update final VIRR manuscript supplement
</commit_message>
<xml_diff>
--- a/virr-iet-public-benchmark-supplement/supplement/VLSIE2026_IET_VIRR_Public_Benchmark_Demonstration.docx
+++ b/virr-iet-public-benchmark-supplement/supplement/VLSIE2026_IET_VIRR_Public_Benchmark_Demonstration.docx
@@ -1781,7 +1781,7 @@
                 <w:color w:val="000000"/>
                 <w:sz w:val="16"/>
               </w:rPr>
-              <w:t>VIRR_full, confidence interval, event definition, energy boundary, N_valid, N_rejected, τ*, θ, Σ[Γ], and reproducibility metadata.</w:t>
+              <w:t>VIRR̂_full, confidence interval, event definition, energy boundary, N_valid, N_rejected, τ*, θ, Σ[Γ], and reproducibility metadata.</w:t>
             </w:r>
           </w:p>
         </w:tc>
@@ -2194,7 +2194,7 @@
           <w:color w:val="000000"/>
           <w:sz w:val="20"/>
         </w:rPr>
-        <w:t>The strongest immediately reproducible validation is public MLPerf Tiny power data. MLPerf Tiny was designed to measure accuracy, latency, and energy for ultra-low-power inference. For this layer, a completed inference produced by a submission that satisfies the benchmark-wide quality requirement is treated as a task-level benchmark outcome. This means N_outcomes is not the same as the number of individually correct samples; per-sample correctness is not recoverable from the public power files. The task-level proxy is</w:t>
+        <w:t>The strongest immediately reproducible public-data demonstration is provided by MLPerf Tiny power results. MLPerf Tiny was designed to measure accuracy, latency, and energy for ultra-low-power inference. For this layer, a completed inference produced by a submission that satisfies the benchmark-wide quality requirement is treated as a task-level benchmark outcome. This means N_outcomes is not the same as the number of individually correct samples; per-sample correctness is not recoverable from the public power files. The task-level proxy is</w:t>
       </w:r>
     </w:p>
     <w:p>
@@ -2226,7 +2226,7 @@
           <w:color w:val="000000"/>
           <w:sz w:val="20"/>
         </w:rPr>
-        <w:t>Using the public MLPerf Tiny v1.3 results repository, 27 power-result files were parsed. The median energy-per-outcome values in the submitted result files were converted to outcomes/J. The calculation is direct: if a submission reports 31.537 µJ/outcome, then VIRR_task = 10⁶/31.537 = 3.17e4 outcomes/J. Accuracy-derived quality scores are used only when the quality statistic is an empirical accuracy fraction.</w:t>
+        <w:t>Using the public MLPerf Tiny v1.3 results repository, 27 public power results were parsed. The median energy-per-outcome values in the submitted result files were converted to outcomes/J. The calculation is direct: if a submission reports 31.537 µJ/outcome, then VIRR_task = 10⁶/31.537 = 3.17e4 outcomes/J. Accuracy-derived quality scores are used only when the quality statistic is an empirical accuracy fraction.</w:t>
       </w:r>
     </w:p>
     <w:p>
@@ -2597,6 +2597,52 @@
           </w:p>
         </w:tc>
       </w:tr>
+      <w:tr>
+        <w:tc>
+          <w:tcPr>
+            <w:tcW w:type="dxa" w:w="2268"/>
+            <w:vAlign w:val="top"/>
+          </w:tcPr>
+          <w:p>
+            <w:pPr>
+              <w:spacing w:after="0"/>
+            </w:pPr>
+            <w:r/>
+            <w:r>
+              <w:rPr>
+                <w:rFonts w:ascii="Times New Roman" w:hAnsi="Times New Roman" w:eastAsia="Times New Roman"/>
+                <w:b w:val="0"/>
+                <w:i w:val="0"/>
+                <w:color w:val="000000"/>
+                <w:sz w:val="14"/>
+              </w:rPr>
+              <w:t>Public mirror</w:t>
+            </w:r>
+          </w:p>
+        </w:tc>
+        <w:tc>
+          <w:tcPr>
+            <w:tcW w:type="dxa" w:w="6406"/>
+            <w:vAlign w:val="top"/>
+          </w:tcPr>
+          <w:p>
+            <w:pPr>
+              <w:spacing w:after="0"/>
+            </w:pPr>
+            <w:r/>
+            <w:r>
+              <w:rPr>
+                <w:rFonts w:ascii="Times New Roman" w:hAnsi="Times New Roman" w:eastAsia="Times New Roman"/>
+                <w:b w:val="0"/>
+                <w:i w:val="0"/>
+                <w:color w:val="000000"/>
+                <w:sz w:val="14"/>
+              </w:rPr>
+              <w:t>https://github.com/MartinPetrasek123/MartinPetrasek123/tree/main/virr-iet-public-benchmark-supplement</w:t>
+            </w:r>
+          </w:p>
+        </w:tc>
+      </w:tr>
     </w:tbl>
     <w:p>
       <w:pPr>
@@ -2680,7 +2726,7 @@
           <w:color w:val="000000"/>
           <w:sz w:val="20"/>
         </w:rPr>
-        <w:t>The parser and derived CSV are provided as supplementary files S1 and S2. If the paper is submitted through a venue portal, the same files should be uploaded as supplementary material; if a public repository is used, S1 and S2 should be deposited without modification so that their SHA-256 digests match the table above.</w:t>
+        <w:t>The parser and derived CSV are provided as supplementary files S1 and S2 with the submission and are mirrored without modification in the public GitHub supplement folder listed above. The SHA-256 digests in the table are the local checksums of the actual submitted files and match the public raw GitHub copies.</w:t>
       </w:r>
     </w:p>
     <w:p>
@@ -4580,7 +4626,7 @@
                 <w:color w:val="000000"/>
                 <w:sz w:val="11"/>
               </w:rPr>
-              <w:t>1 / 0.00%</w:t>
+              <w:t>1 / N.A.</w:t>
             </w:r>
           </w:p>
         </w:tc>
@@ -7414,119 +7460,7 @@
                 <w:color w:val="000000"/>
                 <w:sz w:val="13"/>
               </w:rPr>
-              <w:t>Partial</w:t>
-            </w:r>
-          </w:p>
-        </w:tc>
-      </w:tr>
-      <w:tr>
-        <w:tc>
-          <w:tcPr>
-            <w:tcW w:type="dxa" w:w="1701"/>
-            <w:vAlign w:val="top"/>
-          </w:tcPr>
-          <w:p>
-            <w:pPr>
-              <w:spacing w:after="0"/>
-            </w:pPr>
-            <w:r/>
-            <w:r>
-              <w:rPr>
-                <w:rFonts w:ascii="Times New Roman" w:hAnsi="Times New Roman" w:eastAsia="Times New Roman"/>
-                <w:b w:val="0"/>
-                <w:i w:val="0"/>
-                <w:color w:val="000000"/>
-                <w:sz w:val="13"/>
-              </w:rPr>
-              <w:t>Mythic analog matrix processor</w:t>
-            </w:r>
-          </w:p>
-        </w:tc>
-        <w:tc>
-          <w:tcPr>
-            <w:tcW w:type="dxa" w:w="1871"/>
-            <w:vAlign w:val="top"/>
-          </w:tcPr>
-          <w:p>
-            <w:pPr>
-              <w:spacing w:after="0"/>
-            </w:pPr>
-            <w:r/>
-            <w:r>
-              <w:rPr>
-                <w:rFonts w:ascii="Times New Roman" w:hAnsi="Times New Roman" w:eastAsia="Times New Roman"/>
-                <w:b w:val="0"/>
-                <w:i w:val="0"/>
-                <w:color w:val="000000"/>
-                <w:sz w:val="13"/>
-              </w:rPr>
-              <w:t>Deployment-data dependent</w:t>
-            </w:r>
-          </w:p>
-        </w:tc>
-        <w:tc>
-          <w:tcPr>
-            <w:tcW w:type="dxa" w:w="1814"/>
-            <w:vAlign w:val="top"/>
-          </w:tcPr>
-          <w:p>
-            <w:pPr>
-              <w:spacing w:after="0"/>
-            </w:pPr>
-            <w:r/>
-            <w:r>
-              <w:rPr>
-                <w:rFonts w:ascii="Times New Roman" w:hAnsi="Times New Roman" w:eastAsia="Times New Roman"/>
-                <w:b w:val="0"/>
-                <w:i w:val="0"/>
-                <w:color w:val="000000"/>
-                <w:sz w:val="13"/>
-              </w:rPr>
-              <w:t>Yes from public TOPS/power claims</w:t>
-            </w:r>
-          </w:p>
-        </w:tc>
-        <w:tc>
-          <w:tcPr>
-            <w:tcW w:type="dxa" w:w="2268"/>
-            <w:vAlign w:val="top"/>
-          </w:tcPr>
-          <w:p>
-            <w:pPr>
-              <w:spacing w:after="0"/>
-            </w:pPr>
-            <w:r/>
-            <w:r>
-              <w:rPr>
-                <w:rFonts w:ascii="Times New Roman" w:hAnsi="Times New Roman" w:eastAsia="Times New Roman"/>
-                <w:b w:val="0"/>
-                <w:i w:val="0"/>
-                <w:color w:val="000000"/>
-                <w:sz w:val="13"/>
-              </w:rPr>
-              <w:t>No without measured task energy and persistence rule</w:t>
-            </w:r>
-          </w:p>
-        </w:tc>
-        <w:tc>
-          <w:tcPr>
-            <w:tcW w:type="dxa" w:w="1247"/>
-            <w:vAlign w:val="top"/>
-          </w:tcPr>
-          <w:p>
-            <w:pPr>
-              <w:spacing w:after="0"/>
-            </w:pPr>
-            <w:r/>
-            <w:r>
-              <w:rPr>
-                <w:rFonts w:ascii="Times New Roman" w:hAnsi="Times New Roman" w:eastAsia="Times New Roman"/>
-                <w:b w:val="0"/>
-                <w:i w:val="0"/>
-                <w:color w:val="000000"/>
-                <w:sz w:val="13"/>
-              </w:rPr>
-              <w:t>Product-level estimate</w:t>
+              <w:t>Partial; see neuromorphic references</w:t>
             </w:r>
           </w:p>
         </w:tc>
@@ -9465,7 +9399,7 @@
           <w:color w:val="000000"/>
           <w:sz w:val="20"/>
         </w:rPr>
-        <w:t>For independent event-count and power measurements, the small-error approximation is</w:t>
+        <w:t>For independent event-count and supplied-energy estimates, the small-error approximation is</w:t>
       </w:r>
     </w:p>
     <w:p>
@@ -9696,7 +9630,7 @@
           <w:color w:val="000000"/>
           <w:sz w:val="20"/>
         </w:rPr>
-        <w:t>The original bistable Langevin model is retained as the minimal theoretical example. For an overdamped coordinate in V(x,λₜ) = ax⁴ − b(t)x² − h(t)x, the unbiased reference minima define two metastable regions and the barrier controls the escape time. A controlled protocol lowers or tilts the barrier and the event is accepted only when the final basin remains occupied for τ*.</w:t>
+        <w:t>The original bistable Langevin model is retained as the minimal theoretical example. For an overdamped coordinate in V(x,λₜ) = ax⁴ − b(t)x² − h(t)x, the unbiased reference minima define two metastable regions and the barrier controls the escape time. For the unbiased reference landscape (h = 0) at fixed b(t) = b₀ &gt; 0,</w:t>
       </w:r>
     </w:p>
     <w:p>
@@ -9712,7 +9646,7 @@
           <w:color w:val="000000"/>
           <w:sz w:val="20"/>
         </w:rPr>
-        <w:t>x± = ±√(b/(2a)),    ΔV = b²/(4a).</w:t>
+        <w:t>x± = ±√(b₀/(2a)),    ΔV = b₀²/(4a).</w:t>
       </w:r>
     </w:p>
     <w:p>
@@ -9760,7 +9694,7 @@
           <w:color w:val="000000"/>
           <w:sz w:val="20"/>
         </w:rPr>
-        <w:t>In the weak-noise regime the Kramers escape estimate gives a reference stability time</w:t>
+        <w:t>In the weak-noise, high-barrier regime ΔV ≫ kBT, the Kramers escape estimate gives a reference stability time</w:t>
       </w:r>
     </w:p>
     <w:p>
@@ -9871,7 +9805,7 @@
           <w:color w:val="000000"/>
           <w:sz w:val="20"/>
         </w:rPr>
-        <w:t>Consider three protocols with the same supplied energy E_sup over the same interval. Protocol A produces N accepted events, each with conditional mean entropy Sigma_0. Protocol B produces 2N dissipative segments with Sigma_0/2 each, but every second segment stabilizes, so it also produces N accepted events. Protocol C has the same 2N dissipative segments and the same total entropy, but only N/2 crossings satisfy the residence-time test.</w:t>
+        <w:t>Consider three protocols with the same supplied energy E_sup over the same interval. Protocol A produces N accepted events, each with conditional mean entropy Sigma_0. Protocol B produces 2N dissipative segments with Sigma_0/2 each, but every second segment stabilizes, so it also produces N accepted events. Protocol C has the same 2N dissipative segments and the same total entropy, but only N/2 crossings satisfy the residence-time test. The total entropy budget includes both accepted and rejected dissipative segments.</w:t>
       </w:r>
     </w:p>
     <w:p>
@@ -10674,7 +10608,7 @@
           <w:color w:val="000000"/>
           <w:sz w:val="17"/>
         </w:rPr>
-        <w:t>[4] Ciliberto, S., Experiments in Stochastic Thermodynamics: Short History and Perspectives, Physical Review X, vol. 7, 021051, 2017, doi: 10.1103/PhysRevX.7.021051.</w:t>
+        <w:t>[4] Blouw, P., Choo, X., Hunsberger, E. and Eliasmith, C., Benchmarking Keyword Spotting Efficiency on Neuromorphic Hardware, arXiv:1812.01739, 2018.</w:t>
       </w:r>
     </w:p>
     <w:p>
@@ -10689,7 +10623,7 @@
           <w:color w:val="000000"/>
           <w:sz w:val="17"/>
         </w:rPr>
-        <w:t>[5] Esposito, M. and Van den Broeck, C., Three Detailed Fluctuation Theorems, Physical Review Letters, vol. 104, 090601, 2010, doi: 10.1103/PhysRevLett.104.090601.</w:t>
+        <w:t>[5] Ciliberto, S., Experiments in Stochastic Thermodynamics: Short History and Perspectives, Physical Review X, vol. 7, 021051, 2017, doi: 10.1103/PhysRevX.7.021051.</w:t>
       </w:r>
     </w:p>
     <w:p>
@@ -10704,7 +10638,7 @@
           <w:color w:val="000000"/>
           <w:sz w:val="17"/>
         </w:rPr>
-        <w:t>[6] Horowitz, M., Computing's Energy Problem (and What We Can Do About It), IEEE ISSCC Digest of Technical Papers, pp. 10–14, 2014, doi: 10.1109/ISSCC.2014.6757323.</w:t>
+        <w:t>[6] Davies, M. et al., Loihi: A Neuromorphic Manycore Processor with On-Chip Learning, IEEE Micro, vol. 38, no. 1, pp. 82–99, 2018, doi: 10.1109/MM.2018.112130359.</w:t>
       </w:r>
     </w:p>
     <w:p>
@@ -10719,7 +10653,7 @@
           <w:color w:val="000000"/>
           <w:sz w:val="17"/>
         </w:rPr>
-        <w:t>[7] Hu, X., Mun, H., Meng, J., Liao, Y., Sridharan, A. and Seo, J.-S., A 28nm 20.9–137.2 TOPS/W Output-Stationary SRAM Compute-in-Memory Macro Featuring Dynamic Look-ahead Zero Weight Skipping and Runtime Partial Sum Quantization, IEEE Custom Integrated Circuits Conference (CICC), pp. 1–3, 2025, doi: 10.1109/CICC63670.2025.10982878.</w:t>
+        <w:t>[7] Esposito, M. and Van den Broeck, C., Three Detailed Fluctuation Theorems, Physical Review Letters, vol. 104, 090601, 2010, doi: 10.1103/PhysRevLett.104.090601.</w:t>
       </w:r>
     </w:p>
     <w:p>
@@ -10734,7 +10668,7 @@
           <w:color w:val="000000"/>
           <w:sz w:val="17"/>
         </w:rPr>
-        <w:t>[8] Koomey, J. G., Growth in Data Center Electricity Use 2005 to 2010, Analytics Press, 2011, doi: 10.2139/ssrn.2130878.</w:t>
+        <w:t>[8] Horowitz, M., Computing's Energy Problem (and What We Can Do About It), IEEE ISSCC Digest of Technical Papers, pp. 10–14, 2014, doi: 10.1109/ISSCC.2014.6757323.</w:t>
       </w:r>
     </w:p>
     <w:p>
@@ -10749,7 +10683,7 @@
           <w:color w:val="000000"/>
           <w:sz w:val="17"/>
         </w:rPr>
-        <w:t>[9] Landauer, R., Irreversibility and Heat Generation in the Computing Process, IBM Journal of Research and Development, vol. 5, no. 3, pp. 183–191, 1961, doi: 10.1147/rd.53.0183.</w:t>
+        <w:t>[9] Hu, X., Mun, H., Meng, J., Liao, Y., Sridharan, A. and Seo, J.-S., A 28nm 20.9–137.2 TOPS/W Output-Stationary SRAM Compute-in-Memory Macro Featuring Dynamic Look-ahead Zero Weight Skipping and Runtime Partial Sum Quantization, IEEE Custom Integrated Circuits Conference (CICC), pp. 1–3, 2025, doi: 10.1109/CICC63670.2025.10982878.</w:t>
       </w:r>
     </w:p>
     <w:p>
@@ -10764,7 +10698,7 @@
           <w:color w:val="000000"/>
           <w:sz w:val="17"/>
         </w:rPr>
-        <w:t>[10] Le Gallo, M. et al., A 64-core Mixed-signal In-memory Compute Chip Based on Phase-change Memory for Deep Neural Network Inference, Nature Electronics, vol. 6, pp. 680–693, 2023, doi: 10.1038/s41928-023-01010-1.</w:t>
+        <w:t>[10] Koomey, J. G., Growth in Data Center Electricity Use 2005 to 2010, Analytics Press, 2011, doi: 10.2139/ssrn.2130878.</w:t>
       </w:r>
     </w:p>
     <w:p>
@@ -10779,7 +10713,7 @@
           <w:color w:val="000000"/>
           <w:sz w:val="17"/>
         </w:rPr>
-        <w:t>[11] MLCommons, MLPerf Tiny v1.3 Results Release, https://mlcommons.org/2025/09/mlperf-tiny-v1-3-results/, accessed 2026-08-01.</w:t>
+        <w:t>[11] Landauer, R., Irreversibility and Heat Generation in the Computing Process, IBM Journal of Research and Development, vol. 5, no. 3, pp. 183–191, 1961, doi: 10.1147/rd.53.0183.</w:t>
       </w:r>
     </w:p>
     <w:p>
@@ -10794,7 +10728,7 @@
           <w:color w:val="000000"/>
           <w:sz w:val="17"/>
         </w:rPr>
-        <w:t>[12] MLCommons, MLPerf Tiny v1.3 Public Results Repository, https://github.com/mlcommons/tiny_results_v1.3, accessed 2026-08-01.</w:t>
+        <w:t>[12] Le Gallo, M. et al., A 64-core Mixed-signal In-memory Compute Chip Based on Phase-change Memory for Deep Neural Network Inference, Nature Electronics, vol. 6, pp. 680–693, 2023, doi: 10.1038/s41928-023-01010-1.</w:t>
       </w:r>
     </w:p>
     <w:p>
@@ -10809,7 +10743,7 @@
           <w:color w:val="000000"/>
           <w:sz w:val="17"/>
         </w:rPr>
-        <w:t>[13] Seifert, U., Stochastic Thermodynamics, Fluctuation Theorems and Molecular Machines, Reports on Progress in Physics, vol. 75, 126001, 2012, doi: 10.1088/0034-4885/75/12/126001.</w:t>
+        <w:t>[13] MLCommons, MLPerf Tiny v1.3 Results Release, https://mlcommons.org/2025/09/mlperf-tiny-v1-3-results/, accessed 2026-08-01.</w:t>
       </w:r>
     </w:p>
     <w:p>
@@ -10824,7 +10758,7 @@
           <w:color w:val="000000"/>
           <w:sz w:val="17"/>
         </w:rPr>
-        <w:t>[14] Sivak, D. A. and Crooks, G. E., Thermodynamic Metrics and Optimal Paths, Physical Review Letters, vol. 108, 190602, 2012, doi: 10.1103/PhysRevLett.108.190602.</w:t>
+        <w:t>[14] MLCommons, MLPerf Tiny v1.3 Public Results Repository, https://github.com/mlcommons/tiny_results_v1.3, accessed 2026-08-01.</w:t>
       </w:r>
     </w:p>
     <w:p>
@@ -10839,7 +10773,7 @@
           <w:color w:val="000000"/>
           <w:sz w:val="17"/>
         </w:rPr>
-        <w:t>[15] Tschand, A. et al., MLPerf Power: Benchmarking the Energy Efficiency of Machine Learning Systems from Microwatts to Megawatts for Sustainable AI, arXiv:2410.12032, 2024.</w:t>
+        <w:t>[15] Seifert, U., Stochastic Thermodynamics, Fluctuation Theorems and Molecular Machines, Reports on Progress in Physics, vol. 75, 126001, 2012, doi: 10.1088/0034-4885/75/12/126001.</w:t>
       </w:r>
     </w:p>
     <w:p>
@@ -10854,7 +10788,7 @@
           <w:color w:val="000000"/>
           <w:sz w:val="17"/>
         </w:rPr>
-        <w:t>[16] Wan, W. et al., A Compute-in-Memory Chip Based on Resistive Random-Access Memory, Nature, vol. 608, pp. 504–512, 2022, doi: 10.1038/s41586-022-04992-8. Related preprint: arXiv:2108.07879.</w:t>
+        <w:t>[16] Sivak, D. A. and Crooks, G. E., Thermodynamic Metrics and Optimal Paths, Physical Review Letters, vol. 108, 190602, 2012, doi: 10.1103/PhysRevLett.108.190602.</w:t>
       </w:r>
     </w:p>
     <w:p>
@@ -10869,7 +10803,37 @@
           <w:color w:val="000000"/>
           <w:sz w:val="17"/>
         </w:rPr>
-        <w:t>[17] Young, A. R. et al., Benchmarking Neuromorphic Hardware and Its Energy Expenditure, Frontiers in Neuroscience, vol. 16, 873935, 2022, doi: 10.3389/fnins.2022.873935.</w:t>
+        <w:t>[17] Tschand, A. et al., MLPerf Power: Benchmarking the Energy Efficiency of Machine Learning Systems from Microwatts to Megawatts for Sustainable AI, arXiv:2410.12032, 2024.</w:t>
+      </w:r>
+    </w:p>
+    <w:p>
+      <w:pPr>
+        <w:spacing w:after="20" w:line="245" w:lineRule="auto"/>
+      </w:pPr>
+      <w:r>
+        <w:rPr>
+          <w:rFonts w:ascii="Times New Roman" w:hAnsi="Times New Roman" w:eastAsia="Times New Roman"/>
+          <w:b w:val="0"/>
+          <w:i w:val="0"/>
+          <w:color w:val="000000"/>
+          <w:sz w:val="17"/>
+        </w:rPr>
+        <w:t>[18] Wan, W. et al., A Compute-in-Memory Chip Based on Resistive Random-Access Memory, Nature, vol. 608, pp. 504–512, 2022, doi: 10.1038/s41586-022-04992-8. Related preprint: arXiv:2108.07879.</w:t>
+      </w:r>
+    </w:p>
+    <w:p>
+      <w:pPr>
+        <w:spacing w:after="20" w:line="245" w:lineRule="auto"/>
+      </w:pPr>
+      <w:r>
+        <w:rPr>
+          <w:rFonts w:ascii="Times New Roman" w:hAnsi="Times New Roman" w:eastAsia="Times New Roman"/>
+          <w:b w:val="0"/>
+          <w:i w:val="0"/>
+          <w:color w:val="000000"/>
+          <w:sz w:val="17"/>
+        </w:rPr>
+        <w:t>[19] Young, A. R. et al., Benchmarking Neuromorphic Hardware and Its Energy Expenditure, Frontiers in Neuroscience, vol. 16, 873935, 2022, doi: 10.3389/fnins.2022.873935.</w:t>
       </w:r>
     </w:p>
     <w:p>

</xml_diff>